<commit_message>
feat(documents): plantillas prescripción de cuotas y objeta bases de remate
Agrega dos generadores docxtpl (req #3): excepción de prescripción de la
acción ejecutiva (pagaré en cuotas, art. 464 N°17) y objeta bases de remate.
Las variables derivables (tribunal, rol, carátula, partes, RUTs, patrocinio)
se autocompletan; los hechos no derivables del pagaré quedan como «INDICAR …».

Corrige además un email hardcodeado (hipervínculo mailto) en la plantilla de
abandono que rompía el correo de notificación renderizado.

- registra prescripcion_cuotas y objeta_remate en TEMPLATE_REGISTRY
- amplía el Literal document_type del endpoint de generación
- tests: render limpio + guard anti-fuga de datos del caso fuente
</commit_message>
<xml_diff>
--- a/app/services/document_templates/abandono_3anios.docx
+++ b/app/services/document_templates/abandono_3anios.docx
@@ -2539,7 +2539,7 @@
           <w:sz w:val="24"/>
           <w:szCs w:val="24"/>
         </w:rPr>
-        <w:t>CUARTO OTROSÍ: Ruego a SS. se tenga presente como medio de notificación para los efectos de lo dispuesto en la Ley N° 21.394, en relación al nuevo artículo 254 N° 2 del Código de Procedimiento Civil, el siguiente correo electrónico: {{ abogado_email }}.</w:t>
+        <w:t>CUARTO OTROSÍ: Ruego a SS. se tenga presente como medio de notificación para los efectos de lo dispuesto en la Ley N° 21.394, en relación al nuevo artículo 254 N° 2 del Código de Procedimiento Civil, el siguiente correo electrónico: {{ abogado_email }}</w:t>
       </w:r>
       <w:r>
         <w:rPr>
@@ -2602,17 +2602,6 @@
           <w:szCs w:val="24"/>
         </w:rPr>
       </w:r>
-      <w:hyperlink r:id="rId8" w:history="1">
-        <w:r>
-          <w:rPr>
-            <w:rStyle w:val="Hipervnculo"/>
-            <w:rFonts w:ascii="Cambria" w:hAnsi="Cambria" w:cs="Courier New"/>
-            <w:sz w:val="24"/>
-            <w:szCs w:val="24"/>
-          </w:rPr>
-          <w:t>farroyo@segal.cl</w:t>
-        </w:r>
-      </w:hyperlink>
       <w:r>
         <w:rPr>
           <w:rFonts w:ascii="Cambria" w:hAnsi="Cambria" w:cs="Courier New"/>

</xml_diff>